<commit_message>
docs(laporan bulan-4): lengkapi bukti kerja Database Administrator
Bukti DBA sebelumnya hanya tangkapan dokumentasi API, padahal uraian
tugasnya mencakup model data fisik, skema/indeks, tata kelola akses,
dan dokumentasi ERD serta kamus tabel. Ditambahkan tiga diagram dari
definisi tabel ClickHouse (model fisik tiga lapis dengan mesin dan
pertukaran atomik mart; ERD mart penyaji dengan kunci urut MergeTree
dan dimensi; kamus tabel _silver_meta) serta tangkapan runbook deploy
dan handover pada versi commit 17 September.

Relasi di ERD diverifikasi 9 Okt: kode_negara, kode_wilayah, dan kode
indikator 100% cocok dengan dimensinya. Diagram hanya memuat struktur,
tanpa jumlah baris, agar tidak bertentangan dengan tabel snapshot
2 Oktober. Hanya laporan 02 yang dibangun ulang.
</commit_message>
<xml_diff>
--- a/report/tenaga-ahli/bulan-4/02-Database-Administrator.docx
+++ b/report/tenaga-ahli/bulan-4/02-Database-Administrator.docx
@@ -947,7 +947,7 @@
           <w:color w:val="1A1A1A"/>
           <w:sz w:val="22"/>
         </w:rPr>
-        <w:t>Tabel berikut berasal dari pembacaan inventaris dan isi mart pada 2 Oktober 2026. Jumlah objek saat pemeriksaan tidak diperlakukan sebagai inventaris per 30 September.</w:t>
+        <w:t>Tabel berikut berasal dari pembacaan inventaris dan isi mart pada 2 Oktober 2026. Jumlah objek saat pemeriksaan tidak diperlakukan sebagai inventaris per 30 September. Diagram model fisik, relasi mart, dan kamus tabel audit disusun dari definisi tabel pada gudang data saat pemeriksaan 9 Oktober 2026 dan hanya memuat struktur, bukan jumlah baris. Dokumentasi operasi ditampilkan pada versi yang tercatat 17 September 2026.</w:t>
       </w:r>
     </w:p>
     <w:p>
@@ -1971,7 +1971,7 @@
       <w:r>
         <w:drawing>
           <wp:inline xmlns:a="http://schemas.openxmlformats.org/drawingml/2006/main" xmlns:pic="http://schemas.openxmlformats.org/drawingml/2006/picture">
-            <wp:extent cx="5580000" cy="3875000"/>
+            <wp:extent cx="5580000" cy="6025886"/>
             <wp:docPr id="1" name="Picture 1"/>
             <wp:cNvGraphicFramePr>
               <a:graphicFrameLocks noChangeAspect="1"/>
@@ -1980,11 +1980,235 @@
               <a:graphicData uri="http://schemas.openxmlformats.org/drawingml/2006/picture">
                 <pic:pic>
                   <pic:nvPicPr>
-                    <pic:cNvPr id="0" name="10-api-docs.jpg"/>
+                    <pic:cNvPr id="0" name="20-dba-model-fisik.jpg"/>
                     <pic:cNvPicPr/>
                   </pic:nvPicPr>
                   <pic:blipFill>
                     <a:blip r:embed="rId9"/>
+                    <a:stretch>
+                      <a:fillRect/>
+                    </a:stretch>
+                  </pic:blipFill>
+                  <pic:spPr>
+                    <a:xfrm>
+                      <a:off x="0" y="0"/>
+                      <a:ext cx="5580000" cy="6025886"/>
+                    </a:xfrm>
+                    <a:prstGeom prst="rect"/>
+                  </pic:spPr>
+                </pic:pic>
+              </a:graphicData>
+            </a:graphic>
+          </wp:inline>
+        </w:drawing>
+      </w:r>
+    </w:p>
+    <w:p>
+      <w:pPr>
+        <w:spacing w:after="200"/>
+        <w:jc w:val="center"/>
+      </w:pPr>
+      <w:r>
+        <w:rPr>
+          <w:rFonts w:ascii="Arial" w:hAnsi="Arial"/>
+          <w:i/>
+          <w:color w:val="555555"/>
+          <w:sz w:val="18"/>
+        </w:rPr>
+        <w:t>Gambar 1. Model fisik tiga lapis: mesin penyimpanan tiap lapis, tabel persiapan mart yang ditukar secara atomik, serta pemisahan akun aplikasi hanya-baca dari akun operator. Sumber: SHOW CREATE DATABASE/TABLE dan SHOW GRANTS pada ClickHouse; diagram disusun 9 Oktober 2026.</w:t>
+      </w:r>
+    </w:p>
+    <w:p>
+      <w:pPr>
+        <w:keepNext/>
+        <w:spacing w:before="120" w:after="40"/>
+        <w:jc w:val="center"/>
+      </w:pPr>
+      <w:r>
+        <w:drawing>
+          <wp:inline xmlns:a="http://schemas.openxmlformats.org/drawingml/2006/main" xmlns:pic="http://schemas.openxmlformats.org/drawingml/2006/picture">
+            <wp:extent cx="5580000" cy="2308235"/>
+            <wp:docPr id="2" name="Picture 2"/>
+            <wp:cNvGraphicFramePr>
+              <a:graphicFrameLocks noChangeAspect="1"/>
+            </wp:cNvGraphicFramePr>
+            <a:graphic>
+              <a:graphicData uri="http://schemas.openxmlformats.org/drawingml/2006/picture">
+                <pic:pic>
+                  <pic:nvPicPr>
+                    <pic:cNvPr id="0" name="21-dba-erd-mart.jpg"/>
+                    <pic:cNvPicPr/>
+                  </pic:nvPicPr>
+                  <pic:blipFill>
+                    <a:blip r:embed="rId10"/>
+                    <a:stretch>
+                      <a:fillRect/>
+                    </a:stretch>
+                  </pic:blipFill>
+                  <pic:spPr>
+                    <a:xfrm>
+                      <a:off x="0" y="0"/>
+                      <a:ext cx="5580000" cy="2308235"/>
+                    </a:xfrm>
+                    <a:prstGeom prst="rect"/>
+                  </pic:spPr>
+                </pic:pic>
+              </a:graphicData>
+            </a:graphic>
+          </wp:inline>
+        </w:drawing>
+      </w:r>
+    </w:p>
+    <w:p>
+      <w:pPr>
+        <w:spacing w:after="200"/>
+        <w:jc w:val="center"/>
+      </w:pPr>
+      <w:r>
+        <w:rPr>
+          <w:rFonts w:ascii="Arial" w:hAnsi="Arial"/>
+          <w:i/>
+          <w:color w:val="555555"/>
+          <w:sz w:val="18"/>
+        </w:rPr>
+        <w:t>Gambar 2. Diagram relasi mart penyaji dan dimensi bersama, lengkap dengan tipe kolom dan kunci urut MergeTree yang berfungsi sebagai indeks utama. Sumber: DESCRIBE dan SHOW CREATE TABLE serving.mart_* serta silver.dim_*; diagram disusun 9 Oktober 2026.</w:t>
+      </w:r>
+    </w:p>
+    <w:p>
+      <w:pPr>
+        <w:keepNext/>
+        <w:spacing w:before="120" w:after="40"/>
+        <w:jc w:val="center"/>
+      </w:pPr>
+      <w:r>
+        <w:drawing>
+          <wp:inline xmlns:a="http://schemas.openxmlformats.org/drawingml/2006/main" xmlns:pic="http://schemas.openxmlformats.org/drawingml/2006/picture">
+            <wp:extent cx="5580000" cy="5270831"/>
+            <wp:docPr id="3" name="Picture 3"/>
+            <wp:cNvGraphicFramePr>
+              <a:graphicFrameLocks noChangeAspect="1"/>
+            </wp:cNvGraphicFramePr>
+            <a:graphic>
+              <a:graphicData uri="http://schemas.openxmlformats.org/drawingml/2006/picture">
+                <pic:pic>
+                  <pic:nvPicPr>
+                    <pic:cNvPr id="0" name="22-dba-kamus-audit.jpg"/>
+                    <pic:cNvPicPr/>
+                  </pic:nvPicPr>
+                  <pic:blipFill>
+                    <a:blip r:embed="rId11"/>
+                    <a:stretch>
+                      <a:fillRect/>
+                    </a:stretch>
+                  </pic:blipFill>
+                  <pic:spPr>
+                    <a:xfrm>
+                      <a:off x="0" y="0"/>
+                      <a:ext cx="5580000" cy="5270831"/>
+                    </a:xfrm>
+                    <a:prstGeom prst="rect"/>
+                  </pic:spPr>
+                </pic:pic>
+              </a:graphicData>
+            </a:graphic>
+          </wp:inline>
+        </w:drawing>
+      </w:r>
+    </w:p>
+    <w:p>
+      <w:pPr>
+        <w:spacing w:after="200"/>
+        <w:jc w:val="center"/>
+      </w:pPr>
+      <w:r>
+        <w:rPr>
+          <w:rFonts w:ascii="Arial" w:hAnsi="Arial"/>
+          <w:i/>
+          <w:color w:val="555555"/>
+          <w:sz w:val="18"/>
+        </w:rPr>
+        <w:t>Gambar 3. Kamus tabel catatan mutu dan jejak audit: keputusan tipe kolom, hasil gerbang mutu, karantina, dan riwayat jumlah baris per tabel data bersih. Sumber: SHOW CREATE TABLE _silver_meta.*; diagram disusun 9 Oktober 2026.</w:t>
+      </w:r>
+    </w:p>
+    <w:p>
+      <w:pPr>
+        <w:keepNext/>
+        <w:spacing w:before="120" w:after="40"/>
+        <w:jc w:val="center"/>
+      </w:pPr>
+      <w:r>
+        <w:drawing>
+          <wp:inline xmlns:a="http://schemas.openxmlformats.org/drawingml/2006/main" xmlns:pic="http://schemas.openxmlformats.org/drawingml/2006/picture">
+            <wp:extent cx="5580000" cy="3661875"/>
+            <wp:docPr id="4" name="Picture 4"/>
+            <wp:cNvGraphicFramePr>
+              <a:graphicFrameLocks noChangeAspect="1"/>
+            </wp:cNvGraphicFramePr>
+            <a:graphic>
+              <a:graphicData uri="http://schemas.openxmlformats.org/drawingml/2006/picture">
+                <pic:pic>
+                  <pic:nvPicPr>
+                    <pic:cNvPr id="0" name="23-dba-runbook.jpg"/>
+                    <pic:cNvPicPr/>
+                  </pic:nvPicPr>
+                  <pic:blipFill>
+                    <a:blip r:embed="rId12"/>
+                    <a:stretch>
+                      <a:fillRect/>
+                    </a:stretch>
+                  </pic:blipFill>
+                  <pic:spPr>
+                    <a:xfrm>
+                      <a:off x="0" y="0"/>
+                      <a:ext cx="5580000" cy="3661875"/>
+                    </a:xfrm>
+                    <a:prstGeom prst="rect"/>
+                  </pic:spPr>
+                </pic:pic>
+              </a:graphicData>
+            </a:graphic>
+          </wp:inline>
+        </w:drawing>
+      </w:r>
+    </w:p>
+    <w:p>
+      <w:pPr>
+        <w:spacing w:after="200"/>
+        <w:jc w:val="center"/>
+      </w:pPr>
+      <w:r>
+        <w:rPr>
+          <w:rFonts w:ascii="Arial" w:hAnsi="Arial"/>
+          <w:i/>
+          <w:color w:val="555555"/>
+          <w:sz w:val="18"/>
+        </w:rPr>
+        <w:t>Gambar 4. Runbook deploy aplikasi ke produksi, termasuk pengaturan akses dan rujukan sandi yang disimpan di luar repositori. Sumber: https://github.com/RantAI-dev/DisparDataPlatform/blob/1f8c8ca/docs/DEPLOY-RUNBOOK.md (commit 17 September 2026); tangkapan layar 9 Oktober 2026.</w:t>
+      </w:r>
+    </w:p>
+    <w:p>
+      <w:pPr>
+        <w:keepNext/>
+        <w:spacing w:before="120" w:after="40"/>
+        <w:jc w:val="center"/>
+      </w:pPr>
+      <w:r>
+        <w:drawing>
+          <wp:inline xmlns:a="http://schemas.openxmlformats.org/drawingml/2006/main" xmlns:pic="http://schemas.openxmlformats.org/drawingml/2006/picture">
+            <wp:extent cx="5580000" cy="3875000"/>
+            <wp:docPr id="5" name="Picture 5"/>
+            <wp:cNvGraphicFramePr>
+              <a:graphicFrameLocks noChangeAspect="1"/>
+            </wp:cNvGraphicFramePr>
+            <a:graphic>
+              <a:graphicData uri="http://schemas.openxmlformats.org/drawingml/2006/picture">
+                <pic:pic>
+                  <pic:nvPicPr>
+                    <pic:cNvPr id="0" name="24-dba-handover.jpg"/>
+                    <pic:cNvPicPr/>
+                  </pic:nvPicPr>
+                  <pic:blipFill>
+                    <a:blip r:embed="rId13"/>
                     <a:stretch>
                       <a:fillRect/>
                     </a:stretch>
@@ -2015,7 +2239,63 @@
           <w:color w:val="555555"/>
           <w:sz w:val="18"/>
         </w:rPr>
-        <w:t>Gambar 1. Dokumentasi antarmuka data publik sebagai rujukan akses dataset. Sumber: https://dispar.rantai.dev/docs; tangkapan layar 2 Oktober 2026.</w:t>
+        <w:t>Gambar 5. Panduan serah terima platform data yang menjelaskan alur lapisan penyimpanan untuk engineer baru. Sumber: https://github.com/RantAI-dev/DisparDataPlatform/blob/71fa514/docs/HANDOVER.md (commit 17 September 2026); tangkapan layar 9 Oktober 2026.</w:t>
+      </w:r>
+    </w:p>
+    <w:p>
+      <w:pPr>
+        <w:keepNext/>
+        <w:spacing w:before="120" w:after="40"/>
+        <w:jc w:val="center"/>
+      </w:pPr>
+      <w:r>
+        <w:drawing>
+          <wp:inline xmlns:a="http://schemas.openxmlformats.org/drawingml/2006/main" xmlns:pic="http://schemas.openxmlformats.org/drawingml/2006/picture">
+            <wp:extent cx="5580000" cy="3875000"/>
+            <wp:docPr id="6" name="Picture 6"/>
+            <wp:cNvGraphicFramePr>
+              <a:graphicFrameLocks noChangeAspect="1"/>
+            </wp:cNvGraphicFramePr>
+            <a:graphic>
+              <a:graphicData uri="http://schemas.openxmlformats.org/drawingml/2006/picture">
+                <pic:pic>
+                  <pic:nvPicPr>
+                    <pic:cNvPr id="0" name="10-api-docs.jpg"/>
+                    <pic:cNvPicPr/>
+                  </pic:nvPicPr>
+                  <pic:blipFill>
+                    <a:blip r:embed="rId14"/>
+                    <a:stretch>
+                      <a:fillRect/>
+                    </a:stretch>
+                  </pic:blipFill>
+                  <pic:spPr>
+                    <a:xfrm>
+                      <a:off x="0" y="0"/>
+                      <a:ext cx="5580000" cy="3875000"/>
+                    </a:xfrm>
+                    <a:prstGeom prst="rect"/>
+                  </pic:spPr>
+                </pic:pic>
+              </a:graphicData>
+            </a:graphic>
+          </wp:inline>
+        </w:drawing>
+      </w:r>
+    </w:p>
+    <w:p>
+      <w:pPr>
+        <w:spacing w:after="200"/>
+        <w:jc w:val="center"/>
+      </w:pPr>
+      <w:r>
+        <w:rPr>
+          <w:rFonts w:ascii="Arial" w:hAnsi="Arial"/>
+          <w:i/>
+          <w:color w:val="555555"/>
+          <w:sz w:val="18"/>
+        </w:rPr>
+        <w:t>Gambar 6. Dokumentasi antarmuka data publik sebagai rujukan akses dataset. Sumber: https://dispar.rantai.dev/docs; tangkapan layar 2 Oktober 2026.</w:t>
       </w:r>
     </w:p>
     <w:p>

</xml_diff>